<commit_message>
Updated CV and cover letter
</commit_message>
<xml_diff>
--- a/Broadcast.docx
+++ b/Broadcast.docx
@@ -1,6 +1,6 @@
 
 <file path=word/document.xml><?xml version="1.0" encoding="utf-8"?>
-<w:document xmlns:wpc="http://schemas.microsoft.com/office/word/2010/wordprocessingCanvas" xmlns:cx="http://schemas.microsoft.com/office/drawing/2014/chartex" xmlns:cx1="http://schemas.microsoft.com/office/drawing/2015/9/8/chartex" xmlns:cx2="http://schemas.microsoft.com/office/drawing/2015/10/21/chartex" xmlns:cx3="http://schemas.microsoft.com/office/drawing/2016/5/9/chartex" xmlns:cx4="http://schemas.microsoft.com/office/drawing/2016/5/10/chartex" xmlns:cx5="http://schemas.microsoft.com/office/drawing/2016/5/11/chartex" xmlns:cx6="http://schemas.microsoft.com/office/drawing/2016/5/12/chartex" xmlns:cx7="http://schemas.microsoft.com/office/drawing/2016/5/13/chartex" xmlns:cx8="http://schemas.microsoft.com/office/drawing/2016/5/14/chartex" xmlns:mc="http://schemas.openxmlformats.org/markup-compatibility/2006" xmlns:aink="http://schemas.microsoft.com/office/drawing/2016/ink" xmlns:am3d="http://schemas.microsoft.com/office/drawing/2017/model3d" xmlns:o="urn:schemas-microsoft-com:office:office" xmlns:oel="http://schemas.microsoft.com/office/2019/extlst" xmlns:r="http://schemas.openxmlformats.org/officeDocument/2006/relationships" xmlns:m="http://schemas.openxmlformats.org/officeDocument/2006/math" xmlns:v="urn:schemas-microsoft-com:vml" xmlns:wp14="http://schemas.microsoft.com/office/word/2010/wordprocessingDrawing" xmlns:wp="http://schemas.openxmlformats.org/drawingml/2006/wordprocessingDrawing" xmlns:w10="urn:schemas-microsoft-com:office:word" xmlns:w="http://schemas.openxmlformats.org/wordprocessingml/2006/main" xmlns:w14="http://schemas.microsoft.com/office/word/2010/wordml" xmlns:w15="http://schemas.microsoft.com/office/word/2012/wordml" xmlns:w16cex="http://schemas.microsoft.com/office/word/2018/wordml/cex" xmlns:w16cid="http://schemas.microsoft.com/office/word/2016/wordml/cid" xmlns:w16="http://schemas.microsoft.com/office/word/2018/wordml" xmlns:w16du="http://schemas.microsoft.com/office/word/2023/wordml/word16du" xmlns:w16sdtdh="http://schemas.microsoft.com/office/word/2020/wordml/sdtdatahash" xmlns:w16se="http://schemas.microsoft.com/office/word/2015/wordml/symex" xmlns:wpg="http://schemas.microsoft.com/office/word/2010/wordprocessingGroup" xmlns:wpi="http://schemas.microsoft.com/office/word/2010/wordprocessingInk" xmlns:wne="http://schemas.microsoft.com/office/word/2006/wordml" xmlns:wps="http://schemas.microsoft.com/office/word/2010/wordprocessingShape" mc:Ignorable="w14 w15 w16se w16cid w16 w16cex w16sdtdh wp14">
+<w:document xmlns:wpc="http://schemas.microsoft.com/office/word/2010/wordprocessingCanvas" xmlns:cx="http://schemas.microsoft.com/office/drawing/2014/chartex" xmlns:cx1="http://schemas.microsoft.com/office/drawing/2015/9/8/chartex" xmlns:cx2="http://schemas.microsoft.com/office/drawing/2015/10/21/chartex" xmlns:cx3="http://schemas.microsoft.com/office/drawing/2016/5/9/chartex" xmlns:cx4="http://schemas.microsoft.com/office/drawing/2016/5/10/chartex" xmlns:cx5="http://schemas.microsoft.com/office/drawing/2016/5/11/chartex" xmlns:cx6="http://schemas.microsoft.com/office/drawing/2016/5/12/chartex" xmlns:cx7="http://schemas.microsoft.com/office/drawing/2016/5/13/chartex" xmlns:cx8="http://schemas.microsoft.com/office/drawing/2016/5/14/chartex" xmlns:mc="http://schemas.openxmlformats.org/markup-compatibility/2006" xmlns:aink="http://schemas.microsoft.com/office/drawing/2016/ink" xmlns:am3d="http://schemas.microsoft.com/office/drawing/2017/model3d" xmlns:o="urn:schemas-microsoft-com:office:office" xmlns:oel="http://schemas.microsoft.com/office/2019/extlst" xmlns:r="http://schemas.openxmlformats.org/officeDocument/2006/relationships" xmlns:m="http://schemas.openxmlformats.org/officeDocument/2006/math" xmlns:v="urn:schemas-microsoft-com:vml" xmlns:wp14="http://schemas.microsoft.com/office/word/2010/wordprocessingDrawing" xmlns:wp="http://schemas.openxmlformats.org/drawingml/2006/wordprocessingDrawing" xmlns:w10="urn:schemas-microsoft-com:office:word" xmlns:w="http://schemas.openxmlformats.org/wordprocessingml/2006/main" xmlns:w14="http://schemas.microsoft.com/office/word/2010/wordml" xmlns:w15="http://schemas.microsoft.com/office/word/2012/wordml" xmlns:w16cex="http://schemas.microsoft.com/office/word/2018/wordml/cex" xmlns:w16cid="http://schemas.microsoft.com/office/word/2016/wordml/cid" xmlns:w16="http://schemas.microsoft.com/office/word/2018/wordml" xmlns:w16du="http://schemas.microsoft.com/office/word/2023/wordml/word16du" xmlns:w16sdtdh="http://schemas.microsoft.com/office/word/2020/wordml/sdtdatahash" xmlns:w16sdtfl="http://schemas.microsoft.com/office/word/2024/wordml/sdtformatlock" xmlns:w16se="http://schemas.microsoft.com/office/word/2015/wordml/symex" xmlns:wpg="http://schemas.microsoft.com/office/word/2010/wordprocessingGroup" xmlns:wpi="http://schemas.microsoft.com/office/word/2010/wordprocessingInk" xmlns:wne="http://schemas.microsoft.com/office/word/2006/wordml" xmlns:wps="http://schemas.microsoft.com/office/word/2010/wordprocessingShape" mc:Ignorable="w14 w15 w16se w16cid w16 w16cex w16sdtdh w16sdtfl w16du wp14">
   <w:background w:color="FFFFFF" w:themeColor="background1"/>
   <w:body>
     <w:p>
@@ -222,6 +222,14 @@
               </w:rPr>
             </w:pPr>
           </w:p>
+          <w:p>
+            <w:pPr>
+              <w:spacing w:before="360"/>
+              <w:rPr>
+                <w:color w:val="043D68"/>
+              </w:rPr>
+            </w:pPr>
+          </w:p>
         </w:tc>
         <w:tc>
           <w:tcPr>
@@ -271,19 +279,29 @@
               <w:pStyle w:val="Heading3"/>
             </w:pPr>
             <w:r>
-              <w:t>(+44)07379328098</w:t>
+              <w:t>(+44)</w:t>
+            </w:r>
+            <w:r>
+              <w:t>0</w:t>
+            </w:r>
+            <w:r>
+              <w:t>7379328098</w:t>
             </w:r>
           </w:p>
           <w:p>
             <w:pPr>
               <w:pStyle w:val="Heading3"/>
+              <w:rPr>
+                <w:lang w:val="en-US"/>
+              </w:rPr>
             </w:pPr>
             <w:hyperlink r:id="rId11" w:history="1">
               <w:r>
                 <w:rPr>
                   <w:rStyle w:val="Hyperlink"/>
+                  <w:lang w:val="en-US"/>
                 </w:rPr>
-                <w:t>www.ogirimah.com</w:t>
+                <w:t>www.linkedin.com/in/ogirimah</w:t>
               </w:r>
             </w:hyperlink>
           </w:p>
@@ -296,7 +314,10 @@
               </w:rPr>
             </w:pPr>
             <w:r>
-              <w:t>Hatfield, Hertfordshire, UK</w:t>
+              <w:t>London</w:t>
+            </w:r>
+            <w:r>
+              <w:t>, UK</w:t>
             </w:r>
           </w:p>
         </w:tc>
@@ -345,12 +366,83 @@
               </w:sdtContent>
             </w:sdt>
           </w:p>
-          <w:p/>
           <w:p>
             <w:pPr>
               <w:pStyle w:val="Heading1"/>
             </w:pPr>
             <w:r>
+              <w:t>Information technology support At the UNIVERSITY OF Hertfordshire</w:t>
+            </w:r>
+          </w:p>
+          <w:p>
+            <w:r>
+              <w:t>Sep 2023 – Feb 2024</w:t>
+            </w:r>
+          </w:p>
+          <w:p>
+            <w:pPr>
+              <w:pStyle w:val="ListParagraph"/>
+              <w:numPr>
+                <w:ilvl w:val="0"/>
+                <w:numId w:val="28"/>
+              </w:numPr>
+            </w:pPr>
+            <w:r>
+              <w:t>Provided first-line IT support to students across various academic departments</w:t>
+            </w:r>
+          </w:p>
+          <w:p>
+            <w:pPr>
+              <w:pStyle w:val="ListParagraph"/>
+              <w:numPr>
+                <w:ilvl w:val="0"/>
+                <w:numId w:val="28"/>
+              </w:numPr>
+            </w:pPr>
+            <w:r>
+              <w:t>Team Recognition: Nominated for the Vice Chancellor's Team of the Year Award for outstanding performance and contributions to student success.</w:t>
+            </w:r>
+          </w:p>
+          <w:p>
+            <w:pPr>
+              <w:pStyle w:val="ListParagraph"/>
+              <w:numPr>
+                <w:ilvl w:val="0"/>
+                <w:numId w:val="28"/>
+              </w:numPr>
+            </w:pPr>
+            <w:r>
+              <w:t>Individual Achievement: Recognized by students for exceptional empathy, patience, and effectiveness in resolving IT-related issues.</w:t>
+            </w:r>
+          </w:p>
+          <w:p>
+            <w:pPr>
+              <w:pStyle w:val="ListParagraph"/>
+              <w:numPr>
+                <w:ilvl w:val="0"/>
+                <w:numId w:val="28"/>
+              </w:numPr>
+            </w:pPr>
+            <w:r>
+              <w:t xml:space="preserve">Efficiency: Consistently met or exceeded service level agreements, ensuring timely and efficient </w:t>
+            </w:r>
+            <w:r>
+              <w:t>student support</w:t>
+            </w:r>
+            <w:r>
+              <w:t>.</w:t>
+            </w:r>
+          </w:p>
+          <w:p>
+            <w:pPr>
+              <w:ind w:left="360"/>
+            </w:pPr>
+          </w:p>
+          <w:p>
+            <w:pPr>
+              <w:pStyle w:val="Heading1"/>
+            </w:pPr>
+            <w:r>
               <w:t xml:space="preserve">Senior Broadcast </w:t>
             </w:r>
             <w:r>
@@ -363,7 +455,10 @@
               <w:t>Steam</w:t>
             </w:r>
             <w:r>
-              <w:t xml:space="preserve"> and globe communication limited</w:t>
+              <w:t xml:space="preserve"> and </w:t>
+            </w:r>
+            <w:r>
+              <w:t>Globe Communication Limited</w:t>
             </w:r>
           </w:p>
           <w:p>
@@ -395,13 +490,17 @@
               </w:numPr>
             </w:pPr>
             <w:r>
-              <w:t xml:space="preserve">Was a crucial member of a team of fifteen that designed and </w:t>
-            </w:r>
-            <w:proofErr w:type="spellStart"/>
-            <w:r>
-              <w:t>remodelled</w:t>
-            </w:r>
-            <w:proofErr w:type="spellEnd"/>
+              <w:t xml:space="preserve">Was a crucial member of a team of </w:t>
+            </w:r>
+            <w:r>
+              <w:t>five</w:t>
+            </w:r>
+            <w:r>
+              <w:t xml:space="preserve"> that designed and </w:t>
+            </w:r>
+            <w:r>
+              <w:t>remodeled</w:t>
+            </w:r>
             <w:r>
               <w:t xml:space="preserve"> all the live studios</w:t>
             </w:r>
@@ -437,7 +536,10 @@
               <w:t xml:space="preserve"> engineer</w:t>
             </w:r>
             <w:r>
-              <w:t xml:space="preserve"> at gotel communication ltd</w:t>
+              <w:t xml:space="preserve"> at </w:t>
+            </w:r>
+            <w:r>
+              <w:t>Gotel Communication Ltd</w:t>
             </w:r>
           </w:p>
           <w:p>
@@ -504,14 +606,52 @@
           </w:p>
           <w:p>
             <w:pPr>
+              <w:pStyle w:val="ListParagraph"/>
+            </w:pPr>
+          </w:p>
+          <w:p>
+            <w:pPr>
               <w:pStyle w:val="Subtitle"/>
             </w:pPr>
             <w:r>
+              <w:lastRenderedPageBreak/>
               <w:t>groups</w:t>
             </w:r>
           </w:p>
           <w:p>
             <w:pPr>
+              <w:rPr>
+                <w:b/>
+                <w:bCs/>
+              </w:rPr>
+            </w:pPr>
+            <w:r>
+              <w:rPr>
+                <w:b/>
+                <w:bCs/>
+              </w:rPr>
+              <w:t>BCS MEMBER</w:t>
+            </w:r>
+          </w:p>
+          <w:p>
+            <w:r>
+              <w:t>Jan 2023 to date</w:t>
+            </w:r>
+          </w:p>
+          <w:p>
+            <w:pPr>
+              <w:pStyle w:val="ListParagraph"/>
+              <w:numPr>
+                <w:ilvl w:val="0"/>
+                <w:numId w:val="27"/>
+              </w:numPr>
+            </w:pPr>
+            <w:r>
+              <w:t>Membership Secretary (BCS Hertfordshire)</w:t>
+            </w:r>
+          </w:p>
+          <w:p>
+            <w:pPr>
               <w:pStyle w:val="Heading1"/>
             </w:pPr>
             <w:r>
@@ -523,7 +663,10 @@
               <w:pStyle w:val="Heading2"/>
             </w:pPr>
             <w:r>
-              <w:t>Dec 2021 to Present</w:t>
+              <w:t xml:space="preserve">Dec 2021 to </w:t>
+            </w:r>
+            <w:r>
+              <w:t>date</w:t>
             </w:r>
           </w:p>
           <w:p>
@@ -597,71 +740,6 @@
           <w:tcPr>
             <w:tcW w:w="3411" w:type="dxa"/>
           </w:tcPr>
-          <w:p>
-            <w:pPr>
-              <w:pStyle w:val="Subtitle"/>
-              <w:spacing w:after="360"/>
-            </w:pPr>
-            <w:r>
-              <w:pict w14:anchorId="3E98C07A">
-                <v:line id="Straight Connector 2" o:spid="_x0000_s2057" alt="Decorative" style="visibility:visible;mso-left-percent:-10001;mso-top-percent:-10001;mso-position-horizontal:absolute;mso-position-horizontal-relative:char;mso-position-vertical:absolute;mso-position-vertical-relative:line;mso-left-percent:-10001;mso-top-percent:-10001" from="0,0" to="126.7pt,0" strokecolor="#043d68 [3215]" strokeweight=".5pt">
-                  <v:stroke joinstyle="miter"/>
-                  <w10:wrap type="none"/>
-                  <w10:anchorlock/>
-                </v:line>
-              </w:pict>
-            </w:r>
-          </w:p>
-          <w:p>
-            <w:pPr>
-              <w:pStyle w:val="Subtitle"/>
-            </w:pPr>
-            <w:sdt>
-              <w:sdtPr>
-                <w:id w:val="-609588387"/>
-                <w:placeholder>
-                  <w:docPart w:val="9FFBEEFAF9D8462DA90FBDE95F98173E"/>
-                </w:placeholder>
-                <w:temporary/>
-                <w:showingPlcHdr/>
-                <w15:appearance w15:val="hidden"/>
-              </w:sdtPr>
-              <w:sdtContent>
-                <w:r>
-                  <w:t>About Me</w:t>
-                </w:r>
-              </w:sdtContent>
-            </w:sdt>
-          </w:p>
-          <w:p>
-            <w:sdt>
-              <w:sdtPr>
-                <w:id w:val="1203286039"/>
-                <w:placeholder>
-                  <w:docPart w:val="F724856786F44D6BAEDC34FCFD7D9906"/>
-                </w:placeholder>
-                <w15:appearance w15:val="hidden"/>
-              </w:sdtPr>
-              <w:sdtContent>
-                <w:r>
-                  <w:t xml:space="preserve">I am an experienced broadcast engineer </w:t>
-                </w:r>
-                <w:r>
-                  <w:t xml:space="preserve">building online media delivery platforms that meet </w:t>
-                </w:r>
-                <w:r>
-                  <w:t xml:space="preserve">international standards. I am also an </w:t>
-                </w:r>
-              </w:sdtContent>
-            </w:sdt>
-            <w:r>
-              <w:t>AI enthusiast interested in building chatbots that help students with academics</w:t>
-            </w:r>
-            <w:r>
-              <w:t>.</w:t>
-            </w:r>
-          </w:p>
-          <w:p/>
           <w:p>
             <w:pPr>
               <w:pStyle w:val="Subtitle"/>
@@ -700,7 +778,10 @@
           </w:p>
           <w:p>
             <w:r>
-              <w:t>MSc A</w:t>
+              <w:t>M.Sc.</w:t>
+            </w:r>
+            <w:r>
+              <w:t xml:space="preserve"> A</w:t>
             </w:r>
             <w:r>
               <w:t>I</w:t>
@@ -709,7 +790,10 @@
               <w:t xml:space="preserve"> and Robotics, University of Hertfordshire</w:t>
             </w:r>
             <w:r>
-              <w:t>, In-view</w:t>
+              <w:t>,</w:t>
+            </w:r>
+            <w:r>
+              <w:t xml:space="preserve"> Aug 2024</w:t>
             </w:r>
             <w:r>
               <w:t>.</w:t>
@@ -717,11 +801,57 @@
           </w:p>
           <w:p/>
           <w:p>
-            <w:r>
+            <w:pPr>
               <w:rPr>
                 <w:lang w:val="it-IT"/>
               </w:rPr>
-              <w:t>BEng Telecommunication Engineering, FUT Minna, 2014.</w:t>
+            </w:pPr>
+            <w:r>
+              <w:rPr>
+                <w:lang w:val="it-IT"/>
+              </w:rPr>
+              <w:t>B.Eng.</w:t>
+            </w:r>
+            <w:r>
+              <w:rPr>
+                <w:lang w:val="it-IT"/>
+              </w:rPr>
+              <w:t xml:space="preserve"> Telecommunication Engineering, FUT Minna, 2014.</w:t>
+            </w:r>
+          </w:p>
+          <w:p>
+            <w:pPr>
+              <w:rPr>
+                <w:lang w:val="it-IT"/>
+              </w:rPr>
+            </w:pPr>
+          </w:p>
+          <w:p>
+            <w:pPr>
+              <w:rPr>
+                <w:lang w:val="it-IT"/>
+              </w:rPr>
+            </w:pPr>
+            <w:r>
+              <w:rPr>
+                <w:lang w:val="it-IT"/>
+              </w:rPr>
+              <w:t>Santander Open Academy | Business for All, Harvard Business Publishing, Nov 2024.</w:t>
+            </w:r>
+          </w:p>
+          <w:p>
+            <w:pPr>
+              <w:rPr>
+                <w:lang w:val="it-IT"/>
+              </w:rPr>
+            </w:pPr>
+          </w:p>
+          <w:p>
+            <w:r>
+              <w:rPr>
+                <w:lang w:val="it-IT"/>
+              </w:rPr>
+              <w:t>Skills for the Green Transition, Cambridge Judge Business School, Dec 2023.</w:t>
             </w:r>
           </w:p>
           <w:p>
@@ -877,6 +1007,26 @@
               <w:t>Javascript</w:t>
             </w:r>
           </w:p>
+          <w:p>
+            <w:pPr>
+              <w:rPr>
+                <w:lang w:val="it-IT"/>
+              </w:rPr>
+            </w:pPr>
+            <w:r>
+              <w:rPr>
+                <w:lang w:val="it-IT"/>
+              </w:rPr>
+              <w:t>AWS, GCP</w:t>
+            </w:r>
+          </w:p>
+          <w:p>
+            <w:pPr>
+              <w:rPr>
+                <w:lang w:val="it-IT"/>
+              </w:rPr>
+            </w:pPr>
+          </w:p>
         </w:tc>
       </w:tr>
     </w:tbl>
@@ -898,7 +1048,7 @@
 </file>
 
 <file path=word/endnotes.xml><?xml version="1.0" encoding="utf-8"?>
-<w:endnotes xmlns:wpc="http://schemas.microsoft.com/office/word/2010/wordprocessingCanvas" xmlns:cx="http://schemas.microsoft.com/office/drawing/2014/chartex" xmlns:cx1="http://schemas.microsoft.com/office/drawing/2015/9/8/chartex" xmlns:cx2="http://schemas.microsoft.com/office/drawing/2015/10/21/chartex" xmlns:cx3="http://schemas.microsoft.com/office/drawing/2016/5/9/chartex" xmlns:cx4="http://schemas.microsoft.com/office/drawing/2016/5/10/chartex" xmlns:cx5="http://schemas.microsoft.com/office/drawing/2016/5/11/chartex" xmlns:cx6="http://schemas.microsoft.com/office/drawing/2016/5/12/chartex" xmlns:cx7="http://schemas.microsoft.com/office/drawing/2016/5/13/chartex" xmlns:cx8="http://schemas.microsoft.com/office/drawing/2016/5/14/chartex" xmlns:mc="http://schemas.openxmlformats.org/markup-compatibility/2006" xmlns:aink="http://schemas.microsoft.com/office/drawing/2016/ink" xmlns:am3d="http://schemas.microsoft.com/office/drawing/2017/model3d" xmlns:o="urn:schemas-microsoft-com:office:office" xmlns:oel="http://schemas.microsoft.com/office/2019/extlst" xmlns:r="http://schemas.openxmlformats.org/officeDocument/2006/relationships" xmlns:m="http://schemas.openxmlformats.org/officeDocument/2006/math" xmlns:v="urn:schemas-microsoft-com:vml" xmlns:wp14="http://schemas.microsoft.com/office/word/2010/wordprocessingDrawing" xmlns:wp="http://schemas.openxmlformats.org/drawingml/2006/wordprocessingDrawing" xmlns:w10="urn:schemas-microsoft-com:office:word" xmlns:w="http://schemas.openxmlformats.org/wordprocessingml/2006/main" xmlns:w14="http://schemas.microsoft.com/office/word/2010/wordml" xmlns:w15="http://schemas.microsoft.com/office/word/2012/wordml" xmlns:w16cex="http://schemas.microsoft.com/office/word/2018/wordml/cex" xmlns:w16cid="http://schemas.microsoft.com/office/word/2016/wordml/cid" xmlns:w16="http://schemas.microsoft.com/office/word/2018/wordml" xmlns:w16du="http://schemas.microsoft.com/office/word/2023/wordml/word16du" xmlns:w16sdtdh="http://schemas.microsoft.com/office/word/2020/wordml/sdtdatahash" xmlns:w16se="http://schemas.microsoft.com/office/word/2015/wordml/symex" xmlns:wpg="http://schemas.microsoft.com/office/word/2010/wordprocessingGroup" xmlns:wpi="http://schemas.microsoft.com/office/word/2010/wordprocessingInk" xmlns:wne="http://schemas.microsoft.com/office/word/2006/wordml" xmlns:wps="http://schemas.microsoft.com/office/word/2010/wordprocessingShape" mc:Ignorable="w14 w15 w16se w16cid w16 w16cex w16sdtdh wp14">
+<w:endnotes xmlns:wpc="http://schemas.microsoft.com/office/word/2010/wordprocessingCanvas" xmlns:cx="http://schemas.microsoft.com/office/drawing/2014/chartex" xmlns:cx1="http://schemas.microsoft.com/office/drawing/2015/9/8/chartex" xmlns:cx2="http://schemas.microsoft.com/office/drawing/2015/10/21/chartex" xmlns:cx3="http://schemas.microsoft.com/office/drawing/2016/5/9/chartex" xmlns:cx4="http://schemas.microsoft.com/office/drawing/2016/5/10/chartex" xmlns:cx5="http://schemas.microsoft.com/office/drawing/2016/5/11/chartex" xmlns:cx6="http://schemas.microsoft.com/office/drawing/2016/5/12/chartex" xmlns:cx7="http://schemas.microsoft.com/office/drawing/2016/5/13/chartex" xmlns:cx8="http://schemas.microsoft.com/office/drawing/2016/5/14/chartex" xmlns:mc="http://schemas.openxmlformats.org/markup-compatibility/2006" xmlns:aink="http://schemas.microsoft.com/office/drawing/2016/ink" xmlns:am3d="http://schemas.microsoft.com/office/drawing/2017/model3d" xmlns:o="urn:schemas-microsoft-com:office:office" xmlns:oel="http://schemas.microsoft.com/office/2019/extlst" xmlns:r="http://schemas.openxmlformats.org/officeDocument/2006/relationships" xmlns:m="http://schemas.openxmlformats.org/officeDocument/2006/math" xmlns:v="urn:schemas-microsoft-com:vml" xmlns:wp14="http://schemas.microsoft.com/office/word/2010/wordprocessingDrawing" xmlns:wp="http://schemas.openxmlformats.org/drawingml/2006/wordprocessingDrawing" xmlns:w10="urn:schemas-microsoft-com:office:word" xmlns:w="http://schemas.openxmlformats.org/wordprocessingml/2006/main" xmlns:w14="http://schemas.microsoft.com/office/word/2010/wordml" xmlns:w15="http://schemas.microsoft.com/office/word/2012/wordml" xmlns:w16cex="http://schemas.microsoft.com/office/word/2018/wordml/cex" xmlns:w16cid="http://schemas.microsoft.com/office/word/2016/wordml/cid" xmlns:w16="http://schemas.microsoft.com/office/word/2018/wordml" xmlns:w16du="http://schemas.microsoft.com/office/word/2023/wordml/word16du" xmlns:w16sdtdh="http://schemas.microsoft.com/office/word/2020/wordml/sdtdatahash" xmlns:w16sdtfl="http://schemas.microsoft.com/office/word/2024/wordml/sdtformatlock" xmlns:w16se="http://schemas.microsoft.com/office/word/2015/wordml/symex" xmlns:wpg="http://schemas.microsoft.com/office/word/2010/wordprocessingGroup" xmlns:wpi="http://schemas.microsoft.com/office/word/2010/wordprocessingInk" xmlns:wne="http://schemas.microsoft.com/office/word/2006/wordml" xmlns:wps="http://schemas.microsoft.com/office/word/2010/wordprocessingShape" mc:Ignorable="w14 w15 w16se w16cid w16 w16cex w16sdtdh w16sdtfl w16du wp14">
   <w:endnote w:type="separator" w:id="-1">
     <w:p>
       <w:pPr>
@@ -930,7 +1080,7 @@
 </file>
 
 <file path=word/footnotes.xml><?xml version="1.0" encoding="utf-8"?>
-<w:footnotes xmlns:wpc="http://schemas.microsoft.com/office/word/2010/wordprocessingCanvas" xmlns:cx="http://schemas.microsoft.com/office/drawing/2014/chartex" xmlns:cx1="http://schemas.microsoft.com/office/drawing/2015/9/8/chartex" xmlns:cx2="http://schemas.microsoft.com/office/drawing/2015/10/21/chartex" xmlns:cx3="http://schemas.microsoft.com/office/drawing/2016/5/9/chartex" xmlns:cx4="http://schemas.microsoft.com/office/drawing/2016/5/10/chartex" xmlns:cx5="http://schemas.microsoft.com/office/drawing/2016/5/11/chartex" xmlns:cx6="http://schemas.microsoft.com/office/drawing/2016/5/12/chartex" xmlns:cx7="http://schemas.microsoft.com/office/drawing/2016/5/13/chartex" xmlns:cx8="http://schemas.microsoft.com/office/drawing/2016/5/14/chartex" xmlns:mc="http://schemas.openxmlformats.org/markup-compatibility/2006" xmlns:aink="http://schemas.microsoft.com/office/drawing/2016/ink" xmlns:am3d="http://schemas.microsoft.com/office/drawing/2017/model3d" xmlns:o="urn:schemas-microsoft-com:office:office" xmlns:oel="http://schemas.microsoft.com/office/2019/extlst" xmlns:r="http://schemas.openxmlformats.org/officeDocument/2006/relationships" xmlns:m="http://schemas.openxmlformats.org/officeDocument/2006/math" xmlns:v="urn:schemas-microsoft-com:vml" xmlns:wp14="http://schemas.microsoft.com/office/word/2010/wordprocessingDrawing" xmlns:wp="http://schemas.openxmlformats.org/drawingml/2006/wordprocessingDrawing" xmlns:w10="urn:schemas-microsoft-com:office:word" xmlns:w="http://schemas.openxmlformats.org/wordprocessingml/2006/main" xmlns:w14="http://schemas.microsoft.com/office/word/2010/wordml" xmlns:w15="http://schemas.microsoft.com/office/word/2012/wordml" xmlns:w16cex="http://schemas.microsoft.com/office/word/2018/wordml/cex" xmlns:w16cid="http://schemas.microsoft.com/office/word/2016/wordml/cid" xmlns:w16="http://schemas.microsoft.com/office/word/2018/wordml" xmlns:w16du="http://schemas.microsoft.com/office/word/2023/wordml/word16du" xmlns:w16sdtdh="http://schemas.microsoft.com/office/word/2020/wordml/sdtdatahash" xmlns:w16se="http://schemas.microsoft.com/office/word/2015/wordml/symex" xmlns:wpg="http://schemas.microsoft.com/office/word/2010/wordprocessingGroup" xmlns:wpi="http://schemas.microsoft.com/office/word/2010/wordprocessingInk" xmlns:wne="http://schemas.microsoft.com/office/word/2006/wordml" xmlns:wps="http://schemas.microsoft.com/office/word/2010/wordprocessingShape" mc:Ignorable="w14 w15 w16se w16cid w16 w16cex w16sdtdh wp14">
+<w:footnotes xmlns:wpc="http://schemas.microsoft.com/office/word/2010/wordprocessingCanvas" xmlns:cx="http://schemas.microsoft.com/office/drawing/2014/chartex" xmlns:cx1="http://schemas.microsoft.com/office/drawing/2015/9/8/chartex" xmlns:cx2="http://schemas.microsoft.com/office/drawing/2015/10/21/chartex" xmlns:cx3="http://schemas.microsoft.com/office/drawing/2016/5/9/chartex" xmlns:cx4="http://schemas.microsoft.com/office/drawing/2016/5/10/chartex" xmlns:cx5="http://schemas.microsoft.com/office/drawing/2016/5/11/chartex" xmlns:cx6="http://schemas.microsoft.com/office/drawing/2016/5/12/chartex" xmlns:cx7="http://schemas.microsoft.com/office/drawing/2016/5/13/chartex" xmlns:cx8="http://schemas.microsoft.com/office/drawing/2016/5/14/chartex" xmlns:mc="http://schemas.openxmlformats.org/markup-compatibility/2006" xmlns:aink="http://schemas.microsoft.com/office/drawing/2016/ink" xmlns:am3d="http://schemas.microsoft.com/office/drawing/2017/model3d" xmlns:o="urn:schemas-microsoft-com:office:office" xmlns:oel="http://schemas.microsoft.com/office/2019/extlst" xmlns:r="http://schemas.openxmlformats.org/officeDocument/2006/relationships" xmlns:m="http://schemas.openxmlformats.org/officeDocument/2006/math" xmlns:v="urn:schemas-microsoft-com:vml" xmlns:wp14="http://schemas.microsoft.com/office/word/2010/wordprocessingDrawing" xmlns:wp="http://schemas.openxmlformats.org/drawingml/2006/wordprocessingDrawing" xmlns:w10="urn:schemas-microsoft-com:office:word" xmlns:w="http://schemas.openxmlformats.org/wordprocessingml/2006/main" xmlns:w14="http://schemas.microsoft.com/office/word/2010/wordml" xmlns:w15="http://schemas.microsoft.com/office/word/2012/wordml" xmlns:w16cex="http://schemas.microsoft.com/office/word/2018/wordml/cex" xmlns:w16cid="http://schemas.microsoft.com/office/word/2016/wordml/cid" xmlns:w16="http://schemas.microsoft.com/office/word/2018/wordml" xmlns:w16du="http://schemas.microsoft.com/office/word/2023/wordml/word16du" xmlns:w16sdtdh="http://schemas.microsoft.com/office/word/2020/wordml/sdtdatahash" xmlns:w16sdtfl="http://schemas.microsoft.com/office/word/2024/wordml/sdtformatlock" xmlns:w16se="http://schemas.microsoft.com/office/word/2015/wordml/symex" xmlns:wpg="http://schemas.microsoft.com/office/word/2010/wordprocessingGroup" xmlns:wpi="http://schemas.microsoft.com/office/word/2010/wordprocessingInk" xmlns:wne="http://schemas.microsoft.com/office/word/2006/wordml" xmlns:wps="http://schemas.microsoft.com/office/word/2010/wordprocessingShape" mc:Ignorable="w14 w15 w16se w16cid w16 w16cex w16sdtdh w16sdtfl w16du wp14">
   <w:footnote w:type="separator" w:id="-1">
     <w:p>
       <w:pPr>
@@ -962,7 +1112,7 @@
 </file>
 
 <file path=word/numbering.xml><?xml version="1.0" encoding="utf-8"?>
-<w:numbering xmlns:wpc="http://schemas.microsoft.com/office/word/2010/wordprocessingCanvas" xmlns:cx="http://schemas.microsoft.com/office/drawing/2014/chartex" xmlns:cx1="http://schemas.microsoft.com/office/drawing/2015/9/8/chartex" xmlns:cx2="http://schemas.microsoft.com/office/drawing/2015/10/21/chartex" xmlns:cx3="http://schemas.microsoft.com/office/drawing/2016/5/9/chartex" xmlns:cx4="http://schemas.microsoft.com/office/drawing/2016/5/10/chartex" xmlns:cx5="http://schemas.microsoft.com/office/drawing/2016/5/11/chartex" xmlns:cx6="http://schemas.microsoft.com/office/drawing/2016/5/12/chartex" xmlns:cx7="http://schemas.microsoft.com/office/drawing/2016/5/13/chartex" xmlns:cx8="http://schemas.microsoft.com/office/drawing/2016/5/14/chartex" xmlns:mc="http://schemas.openxmlformats.org/markup-compatibility/2006" xmlns:aink="http://schemas.microsoft.com/office/drawing/2016/ink" xmlns:am3d="http://schemas.microsoft.com/office/drawing/2017/model3d" xmlns:o="urn:schemas-microsoft-com:office:office" xmlns:oel="http://schemas.microsoft.com/office/2019/extlst" xmlns:r="http://schemas.openxmlformats.org/officeDocument/2006/relationships" xmlns:m="http://schemas.openxmlformats.org/officeDocument/2006/math" xmlns:v="urn:schemas-microsoft-com:vml" xmlns:wp14="http://schemas.microsoft.com/office/word/2010/wordprocessingDrawing" xmlns:wp="http://schemas.openxmlformats.org/drawingml/2006/wordprocessingDrawing" xmlns:w10="urn:schemas-microsoft-com:office:word" xmlns:w="http://schemas.openxmlformats.org/wordprocessingml/2006/main" xmlns:w14="http://schemas.microsoft.com/office/word/2010/wordml" xmlns:w15="http://schemas.microsoft.com/office/word/2012/wordml" xmlns:w16cex="http://schemas.microsoft.com/office/word/2018/wordml/cex" xmlns:w16cid="http://schemas.microsoft.com/office/word/2016/wordml/cid" xmlns:w16="http://schemas.microsoft.com/office/word/2018/wordml" xmlns:w16du="http://schemas.microsoft.com/office/word/2023/wordml/word16du" xmlns:w16sdtdh="http://schemas.microsoft.com/office/word/2020/wordml/sdtdatahash" xmlns:w16se="http://schemas.microsoft.com/office/word/2015/wordml/symex" xmlns:wpg="http://schemas.microsoft.com/office/word/2010/wordprocessingGroup" xmlns:wpi="http://schemas.microsoft.com/office/word/2010/wordprocessingInk" xmlns:wne="http://schemas.microsoft.com/office/word/2006/wordml" xmlns:wps="http://schemas.microsoft.com/office/word/2010/wordprocessingShape" mc:Ignorable="w14 w15 w16se w16cid w16 w16cex w16sdtdh wp14">
+<w:numbering xmlns:wpc="http://schemas.microsoft.com/office/word/2010/wordprocessingCanvas" xmlns:cx="http://schemas.microsoft.com/office/drawing/2014/chartex" xmlns:cx1="http://schemas.microsoft.com/office/drawing/2015/9/8/chartex" xmlns:cx2="http://schemas.microsoft.com/office/drawing/2015/10/21/chartex" xmlns:cx3="http://schemas.microsoft.com/office/drawing/2016/5/9/chartex" xmlns:cx4="http://schemas.microsoft.com/office/drawing/2016/5/10/chartex" xmlns:cx5="http://schemas.microsoft.com/office/drawing/2016/5/11/chartex" xmlns:cx6="http://schemas.microsoft.com/office/drawing/2016/5/12/chartex" xmlns:cx7="http://schemas.microsoft.com/office/drawing/2016/5/13/chartex" xmlns:cx8="http://schemas.microsoft.com/office/drawing/2016/5/14/chartex" xmlns:mc="http://schemas.openxmlformats.org/markup-compatibility/2006" xmlns:aink="http://schemas.microsoft.com/office/drawing/2016/ink" xmlns:am3d="http://schemas.microsoft.com/office/drawing/2017/model3d" xmlns:o="urn:schemas-microsoft-com:office:office" xmlns:oel="http://schemas.microsoft.com/office/2019/extlst" xmlns:r="http://schemas.openxmlformats.org/officeDocument/2006/relationships" xmlns:m="http://schemas.openxmlformats.org/officeDocument/2006/math" xmlns:v="urn:schemas-microsoft-com:vml" xmlns:wp14="http://schemas.microsoft.com/office/word/2010/wordprocessingDrawing" xmlns:wp="http://schemas.openxmlformats.org/drawingml/2006/wordprocessingDrawing" xmlns:w10="urn:schemas-microsoft-com:office:word" xmlns:w="http://schemas.openxmlformats.org/wordprocessingml/2006/main" xmlns:w14="http://schemas.microsoft.com/office/word/2010/wordml" xmlns:w15="http://schemas.microsoft.com/office/word/2012/wordml" xmlns:w16cex="http://schemas.microsoft.com/office/word/2018/wordml/cex" xmlns:w16cid="http://schemas.microsoft.com/office/word/2016/wordml/cid" xmlns:w16="http://schemas.microsoft.com/office/word/2018/wordml" xmlns:w16du="http://schemas.microsoft.com/office/word/2023/wordml/word16du" xmlns:w16sdtdh="http://schemas.microsoft.com/office/word/2020/wordml/sdtdatahash" xmlns:w16sdtfl="http://schemas.microsoft.com/office/word/2024/wordml/sdtformatlock" xmlns:w16se="http://schemas.microsoft.com/office/word/2015/wordml/symex" xmlns:wpg="http://schemas.microsoft.com/office/word/2010/wordprocessingGroup" xmlns:wpi="http://schemas.microsoft.com/office/word/2010/wordprocessingInk" xmlns:wne="http://schemas.microsoft.com/office/word/2006/wordml" xmlns:wps="http://schemas.microsoft.com/office/word/2010/wordprocessingShape" mc:Ignorable="w14 w15 w16se w16cid w16 w16cex w16sdtdh w16sdtfl w16du wp14">
   <w:numPicBullet w:numPicBulletId="0">
     <w:pict>
       <v:shapetype id="_x0000_t75" coordsize="21600,21600" o:spt="75" o:preferrelative="t" path="m@4@5l@4@11@9@11@9@5xe" filled="f" stroked="f">
@@ -984,14 +1134,14 @@
         <v:path o:extrusionok="f" gradientshapeok="t" o:connecttype="rect"/>
         <o:lock v:ext="edit" aspectratio="t"/>
       </v:shapetype>
-      <v:shape id="_x0000_i1034" type="#_x0000_t75" style="width:14.25pt;height:14.25pt;visibility:visible" o:gfxdata="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" o:bullet="t">
+      <v:shape id="_x0000_i1114" type="#_x0000_t75" style="width:14.25pt;height:14.25pt;visibility:visible" o:gfxdata="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" o:bullet="t">
         <v:imagedata r:id="rId1" o:title=""/>
       </v:shape>
     </w:pict>
   </w:numPicBullet>
   <w:numPicBullet w:numPicBulletId="1">
     <w:pict>
-      <v:shape id="_x0000_i1035" type="#_x0000_t75" style="width:13.5pt;height:13.5pt;visibility:visible" o:gfxdata="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" o:bullet="t">
+      <v:shape id="_x0000_i1115" type="#_x0000_t75" style="width:13.5pt;height:13.5pt;visibility:visible" o:gfxdata="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" o:bullet="t">
         <v:imagedata r:id="rId2" o:title=""/>
       </v:shape>
     </w:pict>
@@ -2211,6 +2361,119 @@
     </w:lvl>
   </w:abstractNum>
   <w:abstractNum w:abstractNumId="19" w15:restartNumberingAfterBreak="0">
+    <w:nsid w:val="472231A9"/>
+    <w:multiLevelType w:val="hybridMultilevel"/>
+    <w:tmpl w:val="DD48B67E"/>
+    <w:lvl w:ilvl="0" w:tplc="08090001">
+      <w:start w:val="1"/>
+      <w:numFmt w:val="bullet"/>
+      <w:lvlText w:val=""/>
+      <w:lvlJc w:val="left"/>
+      <w:pPr>
+        <w:ind w:left="720" w:hanging="360"/>
+      </w:pPr>
+      <w:rPr>
+        <w:rFonts w:ascii="Symbol" w:hAnsi="Symbol" w:hint="default"/>
+      </w:rPr>
+    </w:lvl>
+    <w:lvl w:ilvl="1" w:tplc="08090003" w:tentative="1">
+      <w:start w:val="1"/>
+      <w:numFmt w:val="bullet"/>
+      <w:lvlText w:val="o"/>
+      <w:lvlJc w:val="left"/>
+      <w:pPr>
+        <w:ind w:left="1440" w:hanging="360"/>
+      </w:pPr>
+      <w:rPr>
+        <w:rFonts w:ascii="Courier New" w:hAnsi="Courier New" w:cs="Courier New" w:hint="default"/>
+      </w:rPr>
+    </w:lvl>
+    <w:lvl w:ilvl="2" w:tplc="08090005" w:tentative="1">
+      <w:start w:val="1"/>
+      <w:numFmt w:val="bullet"/>
+      <w:lvlText w:val=""/>
+      <w:lvlJc w:val="left"/>
+      <w:pPr>
+        <w:ind w:left="2160" w:hanging="360"/>
+      </w:pPr>
+      <w:rPr>
+        <w:rFonts w:ascii="Wingdings" w:hAnsi="Wingdings" w:hint="default"/>
+      </w:rPr>
+    </w:lvl>
+    <w:lvl w:ilvl="3" w:tplc="08090001" w:tentative="1">
+      <w:start w:val="1"/>
+      <w:numFmt w:val="bullet"/>
+      <w:lvlText w:val=""/>
+      <w:lvlJc w:val="left"/>
+      <w:pPr>
+        <w:ind w:left="2880" w:hanging="360"/>
+      </w:pPr>
+      <w:rPr>
+        <w:rFonts w:ascii="Symbol" w:hAnsi="Symbol" w:hint="default"/>
+      </w:rPr>
+    </w:lvl>
+    <w:lvl w:ilvl="4" w:tplc="08090003" w:tentative="1">
+      <w:start w:val="1"/>
+      <w:numFmt w:val="bullet"/>
+      <w:lvlText w:val="o"/>
+      <w:lvlJc w:val="left"/>
+      <w:pPr>
+        <w:ind w:left="3600" w:hanging="360"/>
+      </w:pPr>
+      <w:rPr>
+        <w:rFonts w:ascii="Courier New" w:hAnsi="Courier New" w:cs="Courier New" w:hint="default"/>
+      </w:rPr>
+    </w:lvl>
+    <w:lvl w:ilvl="5" w:tplc="08090005" w:tentative="1">
+      <w:start w:val="1"/>
+      <w:numFmt w:val="bullet"/>
+      <w:lvlText w:val=""/>
+      <w:lvlJc w:val="left"/>
+      <w:pPr>
+        <w:ind w:left="4320" w:hanging="360"/>
+      </w:pPr>
+      <w:rPr>
+        <w:rFonts w:ascii="Wingdings" w:hAnsi="Wingdings" w:hint="default"/>
+      </w:rPr>
+    </w:lvl>
+    <w:lvl w:ilvl="6" w:tplc="08090001" w:tentative="1">
+      <w:start w:val="1"/>
+      <w:numFmt w:val="bullet"/>
+      <w:lvlText w:val=""/>
+      <w:lvlJc w:val="left"/>
+      <w:pPr>
+        <w:ind w:left="5040" w:hanging="360"/>
+      </w:pPr>
+      <w:rPr>
+        <w:rFonts w:ascii="Symbol" w:hAnsi="Symbol" w:hint="default"/>
+      </w:rPr>
+    </w:lvl>
+    <w:lvl w:ilvl="7" w:tplc="08090003" w:tentative="1">
+      <w:start w:val="1"/>
+      <w:numFmt w:val="bullet"/>
+      <w:lvlText w:val="o"/>
+      <w:lvlJc w:val="left"/>
+      <w:pPr>
+        <w:ind w:left="5760" w:hanging="360"/>
+      </w:pPr>
+      <w:rPr>
+        <w:rFonts w:ascii="Courier New" w:hAnsi="Courier New" w:cs="Courier New" w:hint="default"/>
+      </w:rPr>
+    </w:lvl>
+    <w:lvl w:ilvl="8" w:tplc="08090005" w:tentative="1">
+      <w:start w:val="1"/>
+      <w:numFmt w:val="bullet"/>
+      <w:lvlText w:val=""/>
+      <w:lvlJc w:val="left"/>
+      <w:pPr>
+        <w:ind w:left="6480" w:hanging="360"/>
+      </w:pPr>
+      <w:rPr>
+        <w:rFonts w:ascii="Wingdings" w:hAnsi="Wingdings" w:hint="default"/>
+      </w:rPr>
+    </w:lvl>
+  </w:abstractNum>
+  <w:abstractNum w:abstractNumId="20" w15:restartNumberingAfterBreak="0">
     <w:nsid w:val="4B827943"/>
     <w:multiLevelType w:val="hybridMultilevel"/>
     <w:tmpl w:val="67848C70"/>
@@ -2322,7 +2585,120 @@
       </w:rPr>
     </w:lvl>
   </w:abstractNum>
-  <w:abstractNum w:abstractNumId="20" w15:restartNumberingAfterBreak="0">
+  <w:abstractNum w:abstractNumId="21" w15:restartNumberingAfterBreak="0">
+    <w:nsid w:val="4F43027E"/>
+    <w:multiLevelType w:val="hybridMultilevel"/>
+    <w:tmpl w:val="A9E44110"/>
+    <w:lvl w:ilvl="0" w:tplc="08090001">
+      <w:start w:val="1"/>
+      <w:numFmt w:val="bullet"/>
+      <w:lvlText w:val=""/>
+      <w:lvlJc w:val="left"/>
+      <w:pPr>
+        <w:ind w:left="720" w:hanging="360"/>
+      </w:pPr>
+      <w:rPr>
+        <w:rFonts w:ascii="Symbol" w:hAnsi="Symbol" w:hint="default"/>
+      </w:rPr>
+    </w:lvl>
+    <w:lvl w:ilvl="1" w:tplc="08090003" w:tentative="1">
+      <w:start w:val="1"/>
+      <w:numFmt w:val="bullet"/>
+      <w:lvlText w:val="o"/>
+      <w:lvlJc w:val="left"/>
+      <w:pPr>
+        <w:ind w:left="1440" w:hanging="360"/>
+      </w:pPr>
+      <w:rPr>
+        <w:rFonts w:ascii="Courier New" w:hAnsi="Courier New" w:cs="Courier New" w:hint="default"/>
+      </w:rPr>
+    </w:lvl>
+    <w:lvl w:ilvl="2" w:tplc="08090005" w:tentative="1">
+      <w:start w:val="1"/>
+      <w:numFmt w:val="bullet"/>
+      <w:lvlText w:val=""/>
+      <w:lvlJc w:val="left"/>
+      <w:pPr>
+        <w:ind w:left="2160" w:hanging="360"/>
+      </w:pPr>
+      <w:rPr>
+        <w:rFonts w:ascii="Wingdings" w:hAnsi="Wingdings" w:hint="default"/>
+      </w:rPr>
+    </w:lvl>
+    <w:lvl w:ilvl="3" w:tplc="08090001" w:tentative="1">
+      <w:start w:val="1"/>
+      <w:numFmt w:val="bullet"/>
+      <w:lvlText w:val=""/>
+      <w:lvlJc w:val="left"/>
+      <w:pPr>
+        <w:ind w:left="2880" w:hanging="360"/>
+      </w:pPr>
+      <w:rPr>
+        <w:rFonts w:ascii="Symbol" w:hAnsi="Symbol" w:hint="default"/>
+      </w:rPr>
+    </w:lvl>
+    <w:lvl w:ilvl="4" w:tplc="08090003" w:tentative="1">
+      <w:start w:val="1"/>
+      <w:numFmt w:val="bullet"/>
+      <w:lvlText w:val="o"/>
+      <w:lvlJc w:val="left"/>
+      <w:pPr>
+        <w:ind w:left="3600" w:hanging="360"/>
+      </w:pPr>
+      <w:rPr>
+        <w:rFonts w:ascii="Courier New" w:hAnsi="Courier New" w:cs="Courier New" w:hint="default"/>
+      </w:rPr>
+    </w:lvl>
+    <w:lvl w:ilvl="5" w:tplc="08090005" w:tentative="1">
+      <w:start w:val="1"/>
+      <w:numFmt w:val="bullet"/>
+      <w:lvlText w:val=""/>
+      <w:lvlJc w:val="left"/>
+      <w:pPr>
+        <w:ind w:left="4320" w:hanging="360"/>
+      </w:pPr>
+      <w:rPr>
+        <w:rFonts w:ascii="Wingdings" w:hAnsi="Wingdings" w:hint="default"/>
+      </w:rPr>
+    </w:lvl>
+    <w:lvl w:ilvl="6" w:tplc="08090001" w:tentative="1">
+      <w:start w:val="1"/>
+      <w:numFmt w:val="bullet"/>
+      <w:lvlText w:val=""/>
+      <w:lvlJc w:val="left"/>
+      <w:pPr>
+        <w:ind w:left="5040" w:hanging="360"/>
+      </w:pPr>
+      <w:rPr>
+        <w:rFonts w:ascii="Symbol" w:hAnsi="Symbol" w:hint="default"/>
+      </w:rPr>
+    </w:lvl>
+    <w:lvl w:ilvl="7" w:tplc="08090003" w:tentative="1">
+      <w:start w:val="1"/>
+      <w:numFmt w:val="bullet"/>
+      <w:lvlText w:val="o"/>
+      <w:lvlJc w:val="left"/>
+      <w:pPr>
+        <w:ind w:left="5760" w:hanging="360"/>
+      </w:pPr>
+      <w:rPr>
+        <w:rFonts w:ascii="Courier New" w:hAnsi="Courier New" w:cs="Courier New" w:hint="default"/>
+      </w:rPr>
+    </w:lvl>
+    <w:lvl w:ilvl="8" w:tplc="08090005" w:tentative="1">
+      <w:start w:val="1"/>
+      <w:numFmt w:val="bullet"/>
+      <w:lvlText w:val=""/>
+      <w:lvlJc w:val="left"/>
+      <w:pPr>
+        <w:ind w:left="6480" w:hanging="360"/>
+      </w:pPr>
+      <w:rPr>
+        <w:rFonts w:ascii="Wingdings" w:hAnsi="Wingdings" w:hint="default"/>
+      </w:rPr>
+    </w:lvl>
+  </w:abstractNum>
+  <w:abstractNum w:abstractNumId="22" w15:restartNumberingAfterBreak="0">
     <w:nsid w:val="51DC2DDD"/>
     <w:multiLevelType w:val="hybridMultilevel"/>
     <w:tmpl w:val="56C8CC14"/>
@@ -2435,7 +2811,7 @@
       </w:rPr>
     </w:lvl>
   </w:abstractNum>
-  <w:abstractNum w:abstractNumId="21" w15:restartNumberingAfterBreak="0">
+  <w:abstractNum w:abstractNumId="23" w15:restartNumberingAfterBreak="0">
     <w:nsid w:val="5AA23814"/>
     <w:multiLevelType w:val="hybridMultilevel"/>
     <w:tmpl w:val="3FE47DE0"/>
@@ -2548,7 +2924,7 @@
       </w:rPr>
     </w:lvl>
   </w:abstractNum>
-  <w:abstractNum w:abstractNumId="22" w15:restartNumberingAfterBreak="0">
+  <w:abstractNum w:abstractNumId="24" w15:restartNumberingAfterBreak="0">
     <w:nsid w:val="77833FE2"/>
     <w:multiLevelType w:val="hybridMultilevel"/>
     <w:tmpl w:val="FD36A09C"/>
@@ -2661,7 +3037,7 @@
       </w:rPr>
     </w:lvl>
   </w:abstractNum>
-  <w:abstractNum w:abstractNumId="23" w15:restartNumberingAfterBreak="0">
+  <w:abstractNum w:abstractNumId="25" w15:restartNumberingAfterBreak="0">
     <w:nsid w:val="78082985"/>
     <w:multiLevelType w:val="hybridMultilevel"/>
     <w:tmpl w:val="AE686546"/>
@@ -2778,7 +3154,7 @@
     <w:abstractNumId w:val="11"/>
   </w:num>
   <w:num w:numId="2" w16cid:durableId="1633823338">
-    <w:abstractNumId w:val="22"/>
+    <w:abstractNumId w:val="24"/>
   </w:num>
   <w:num w:numId="3" w16cid:durableId="1835339782">
     <w:abstractNumId w:val="14"/>
@@ -2787,16 +3163,16 @@
     <w:abstractNumId w:val="16"/>
   </w:num>
   <w:num w:numId="5" w16cid:durableId="27066385">
-    <w:abstractNumId w:val="21"/>
+    <w:abstractNumId w:val="23"/>
   </w:num>
   <w:num w:numId="6" w16cid:durableId="629288324">
     <w:abstractNumId w:val="18"/>
   </w:num>
   <w:num w:numId="7" w16cid:durableId="2102947809">
-    <w:abstractNumId w:val="20"/>
+    <w:abstractNumId w:val="22"/>
   </w:num>
   <w:num w:numId="8" w16cid:durableId="1044523296">
-    <w:abstractNumId w:val="19"/>
+    <w:abstractNumId w:val="20"/>
   </w:num>
   <w:num w:numId="9" w16cid:durableId="1226068447">
     <w:abstractNumId w:val="9"/>
@@ -2841,7 +3217,7 @@
     <w:abstractNumId w:val="15"/>
   </w:num>
   <w:num w:numId="23" w16cid:durableId="1006328937">
-    <w:abstractNumId w:val="23"/>
+    <w:abstractNumId w:val="25"/>
   </w:num>
   <w:num w:numId="24" w16cid:durableId="1597638804">
     <w:abstractNumId w:val="17"/>
@@ -2852,11 +3228,17 @@
   <w:num w:numId="26" w16cid:durableId="2086799677">
     <w:abstractNumId w:val="13"/>
   </w:num>
+  <w:num w:numId="27" w16cid:durableId="1543323146">
+    <w:abstractNumId w:val="19"/>
+  </w:num>
+  <w:num w:numId="28" w16cid:durableId="228809702">
+    <w:abstractNumId w:val="21"/>
+  </w:num>
 </w:numbering>
 </file>
 
 <file path=word/styles.xml><?xml version="1.0" encoding="utf-8"?>
-<w:styles xmlns:mc="http://schemas.openxmlformats.org/markup-compatibility/2006" xmlns:r="http://schemas.openxmlformats.org/officeDocument/2006/relationships" xmlns:w="http://schemas.openxmlformats.org/wordprocessingml/2006/main" xmlns:w14="http://schemas.microsoft.com/office/word/2010/wordml" xmlns:w15="http://schemas.microsoft.com/office/word/2012/wordml" xmlns:w16cex="http://schemas.microsoft.com/office/word/2018/wordml/cex" xmlns:w16cid="http://schemas.microsoft.com/office/word/2016/wordml/cid" xmlns:w16="http://schemas.microsoft.com/office/word/2018/wordml" xmlns:w16sdtdh="http://schemas.microsoft.com/office/word/2020/wordml/sdtdatahash" xmlns:w16se="http://schemas.microsoft.com/office/word/2015/wordml/symex" mc:Ignorable="w14 w15 w16se w16cid w16 w16cex w16sdtdh">
+<w:styles xmlns:mc="http://schemas.openxmlformats.org/markup-compatibility/2006" xmlns:r="http://schemas.openxmlformats.org/officeDocument/2006/relationships" xmlns:w="http://schemas.openxmlformats.org/wordprocessingml/2006/main" xmlns:w14="http://schemas.microsoft.com/office/word/2010/wordml" xmlns:w15="http://schemas.microsoft.com/office/word/2012/wordml" xmlns:w16cex="http://schemas.microsoft.com/office/word/2018/wordml/cex" xmlns:w16cid="http://schemas.microsoft.com/office/word/2016/wordml/cid" xmlns:w16="http://schemas.microsoft.com/office/word/2018/wordml" xmlns:w16du="http://schemas.microsoft.com/office/word/2023/wordml/word16du" xmlns:w16sdtdh="http://schemas.microsoft.com/office/word/2020/wordml/sdtdatahash" xmlns:w16sdtfl="http://schemas.microsoft.com/office/word/2024/wordml/sdtformatlock" xmlns:w16se="http://schemas.microsoft.com/office/word/2015/wordml/symex" mc:Ignorable="w14 w15 w16se w16cid w16 w16cex w16sdtdh w16sdtfl w16du">
   <w:docDefaults>
     <w:rPrDefault>
       <w:rPr>
@@ -3382,7 +3764,6 @@
   <w:style w:type="character" w:default="1" w:styleId="DefaultParagraphFont">
     <w:name w:val="Default Paragraph Font"/>
     <w:uiPriority w:val="1"/>
-    <w:semiHidden/>
     <w:unhideWhenUsed/>
   </w:style>
   <w:style w:type="table" w:default="1" w:styleId="TableNormal">
@@ -3835,7 +4216,7 @@
 </file>
 
 <file path=word/glossary/document.xml><?xml version="1.0" encoding="utf-8"?>
-<w:glossaryDocument xmlns:wpc="http://schemas.microsoft.com/office/word/2010/wordprocessingCanvas" xmlns:cx="http://schemas.microsoft.com/office/drawing/2014/chartex" xmlns:cx1="http://schemas.microsoft.com/office/drawing/2015/9/8/chartex" xmlns:cx2="http://schemas.microsoft.com/office/drawing/2015/10/21/chartex" xmlns:cx3="http://schemas.microsoft.com/office/drawing/2016/5/9/chartex" xmlns:cx4="http://schemas.microsoft.com/office/drawing/2016/5/10/chartex" xmlns:cx5="http://schemas.microsoft.com/office/drawing/2016/5/11/chartex" xmlns:cx6="http://schemas.microsoft.com/office/drawing/2016/5/12/chartex" xmlns:cx7="http://schemas.microsoft.com/office/drawing/2016/5/13/chartex" xmlns:cx8="http://schemas.microsoft.com/office/drawing/2016/5/14/chartex" xmlns:mc="http://schemas.openxmlformats.org/markup-compatibility/2006" xmlns:aink="http://schemas.microsoft.com/office/drawing/2016/ink" xmlns:am3d="http://schemas.microsoft.com/office/drawing/2017/model3d" xmlns:o="urn:schemas-microsoft-com:office:office" xmlns:oel="http://schemas.microsoft.com/office/2019/extlst" xmlns:r="http://schemas.openxmlformats.org/officeDocument/2006/relationships" xmlns:m="http://schemas.openxmlformats.org/officeDocument/2006/math" xmlns:v="urn:schemas-microsoft-com:vml" xmlns:wp14="http://schemas.microsoft.com/office/word/2010/wordprocessingDrawing" xmlns:wp="http://schemas.openxmlformats.org/drawingml/2006/wordprocessingDrawing" xmlns:w10="urn:schemas-microsoft-com:office:word" xmlns:w="http://schemas.openxmlformats.org/wordprocessingml/2006/main" xmlns:w14="http://schemas.microsoft.com/office/word/2010/wordml" xmlns:w15="http://schemas.microsoft.com/office/word/2012/wordml" xmlns:w16cex="http://schemas.microsoft.com/office/word/2018/wordml/cex" xmlns:w16cid="http://schemas.microsoft.com/office/word/2016/wordml/cid" xmlns:w16="http://schemas.microsoft.com/office/word/2018/wordml" xmlns:w16du="http://schemas.microsoft.com/office/word/2023/wordml/word16du" xmlns:w16sdtdh="http://schemas.microsoft.com/office/word/2020/wordml/sdtdatahash" xmlns:w16se="http://schemas.microsoft.com/office/word/2015/wordml/symex" xmlns:wpg="http://schemas.microsoft.com/office/word/2010/wordprocessingGroup" xmlns:wpi="http://schemas.microsoft.com/office/word/2010/wordprocessingInk" xmlns:wne="http://schemas.microsoft.com/office/word/2006/wordml" xmlns:wps="http://schemas.microsoft.com/office/word/2010/wordprocessingShape" mc:Ignorable="w14 w15 w16se w16cid w16 w16cex w16sdtdh wp14">
+<w:glossaryDocument xmlns:wpc="http://schemas.microsoft.com/office/word/2010/wordprocessingCanvas" xmlns:cx="http://schemas.microsoft.com/office/drawing/2014/chartex" xmlns:cx1="http://schemas.microsoft.com/office/drawing/2015/9/8/chartex" xmlns:cx2="http://schemas.microsoft.com/office/drawing/2015/10/21/chartex" xmlns:cx3="http://schemas.microsoft.com/office/drawing/2016/5/9/chartex" xmlns:cx4="http://schemas.microsoft.com/office/drawing/2016/5/10/chartex" xmlns:cx5="http://schemas.microsoft.com/office/drawing/2016/5/11/chartex" xmlns:cx6="http://schemas.microsoft.com/office/drawing/2016/5/12/chartex" xmlns:cx7="http://schemas.microsoft.com/office/drawing/2016/5/13/chartex" xmlns:cx8="http://schemas.microsoft.com/office/drawing/2016/5/14/chartex" xmlns:mc="http://schemas.openxmlformats.org/markup-compatibility/2006" xmlns:aink="http://schemas.microsoft.com/office/drawing/2016/ink" xmlns:am3d="http://schemas.microsoft.com/office/drawing/2017/model3d" xmlns:o="urn:schemas-microsoft-com:office:office" xmlns:oel="http://schemas.microsoft.com/office/2019/extlst" xmlns:r="http://schemas.openxmlformats.org/officeDocument/2006/relationships" xmlns:m="http://schemas.openxmlformats.org/officeDocument/2006/math" xmlns:v="urn:schemas-microsoft-com:vml" xmlns:wp14="http://schemas.microsoft.com/office/word/2010/wordprocessingDrawing" xmlns:wp="http://schemas.openxmlformats.org/drawingml/2006/wordprocessingDrawing" xmlns:w10="urn:schemas-microsoft-com:office:word" xmlns:w="http://schemas.openxmlformats.org/wordprocessingml/2006/main" xmlns:w14="http://schemas.microsoft.com/office/word/2010/wordml" xmlns:w15="http://schemas.microsoft.com/office/word/2012/wordml" xmlns:w16cex="http://schemas.microsoft.com/office/word/2018/wordml/cex" xmlns:w16cid="http://schemas.microsoft.com/office/word/2016/wordml/cid" xmlns:w16="http://schemas.microsoft.com/office/word/2018/wordml" xmlns:w16du="http://schemas.microsoft.com/office/word/2023/wordml/word16du" xmlns:w16sdtdh="http://schemas.microsoft.com/office/word/2020/wordml/sdtdatahash" xmlns:w16sdtfl="http://schemas.microsoft.com/office/word/2024/wordml/sdtformatlock" xmlns:w16se="http://schemas.microsoft.com/office/word/2015/wordml/symex" xmlns:wpg="http://schemas.microsoft.com/office/word/2010/wordprocessingGroup" xmlns:wpi="http://schemas.microsoft.com/office/word/2010/wordprocessingInk" xmlns:wne="http://schemas.microsoft.com/office/word/2006/wordml" xmlns:wps="http://schemas.microsoft.com/office/word/2010/wordprocessingShape" mc:Ignorable="w14 w15 w16se w16cid w16 w16cex w16sdtdh w16sdtfl w16du wp14">
   <w:docParts>
     <w:docPart>
       <w:docPartPr>
@@ -3917,58 +4298,6 @@
     </w:docPart>
     <w:docPart>
       <w:docPartPr>
-        <w:name w:val="9FFBEEFAF9D8462DA90FBDE95F98173E"/>
-        <w:category>
-          <w:name w:val="General"/>
-          <w:gallery w:val="placeholder"/>
-        </w:category>
-        <w:types>
-          <w:type w:val="bbPlcHdr"/>
-        </w:types>
-        <w:behaviors>
-          <w:behavior w:val="content"/>
-        </w:behaviors>
-        <w:guid w:val="{D38191BB-BE16-467B-9511-182CB0867551}"/>
-      </w:docPartPr>
-      <w:docPartBody>
-        <w:p>
-          <w:pPr>
-            <w:pStyle w:val="9FFBEEFAF9D8462DA90FBDE95F98173E"/>
-          </w:pPr>
-          <w:r>
-            <w:t>About Me</w:t>
-          </w:r>
-        </w:p>
-      </w:docPartBody>
-    </w:docPart>
-    <w:docPart>
-      <w:docPartPr>
-        <w:name w:val="F724856786F44D6BAEDC34FCFD7D9906"/>
-        <w:category>
-          <w:name w:val="General"/>
-          <w:gallery w:val="placeholder"/>
-        </w:category>
-        <w:types>
-          <w:type w:val="bbPlcHdr"/>
-        </w:types>
-        <w:behaviors>
-          <w:behavior w:val="content"/>
-        </w:behaviors>
-        <w:guid w:val="{4E86D12E-8FC7-41AF-82EC-3F14C7600593}"/>
-      </w:docPartPr>
-      <w:docPartBody>
-        <w:p>
-          <w:pPr>
-            <w:pStyle w:val="F724856786F44D6BAEDC34FCFD7D9906"/>
-          </w:pPr>
-          <w:r>
-            <w:t>I am passionate about designing digital experiences that are both visually stunning and intuitive, and always strive to create designs that delight and engage users.</w:t>
-          </w:r>
-        </w:p>
-      </w:docPartBody>
-    </w:docPart>
-    <w:docPart>
-      <w:docPartPr>
         <w:name w:val="4351941664DB40E6B959438F25254B9F"/>
         <w:category>
           <w:name w:val="General"/>
@@ -4024,7 +4353,7 @@
 </file>
 
 <file path=word/glossary/fontTable.xml><?xml version="1.0" encoding="utf-8"?>
-<w:fonts xmlns:mc="http://schemas.openxmlformats.org/markup-compatibility/2006" xmlns:r="http://schemas.openxmlformats.org/officeDocument/2006/relationships" xmlns:w="http://schemas.openxmlformats.org/wordprocessingml/2006/main" xmlns:w14="http://schemas.microsoft.com/office/word/2010/wordml" xmlns:w15="http://schemas.microsoft.com/office/word/2012/wordml" xmlns:w16cex="http://schemas.microsoft.com/office/word/2018/wordml/cex" xmlns:w16cid="http://schemas.microsoft.com/office/word/2016/wordml/cid" xmlns:w16="http://schemas.microsoft.com/office/word/2018/wordml" xmlns:w16sdtdh="http://schemas.microsoft.com/office/word/2020/wordml/sdtdatahash" xmlns:w16se="http://schemas.microsoft.com/office/word/2015/wordml/symex" mc:Ignorable="w14 w15 w16se w16cid w16 w16cex w16sdtdh">
+<w:fonts xmlns:mc="http://schemas.openxmlformats.org/markup-compatibility/2006" xmlns:r="http://schemas.openxmlformats.org/officeDocument/2006/relationships" xmlns:w="http://schemas.openxmlformats.org/wordprocessingml/2006/main" xmlns:w14="http://schemas.microsoft.com/office/word/2010/wordml" xmlns:w15="http://schemas.microsoft.com/office/word/2012/wordml" xmlns:w16cex="http://schemas.microsoft.com/office/word/2018/wordml/cex" xmlns:w16cid="http://schemas.microsoft.com/office/word/2016/wordml/cid" xmlns:w16="http://schemas.microsoft.com/office/word/2018/wordml" xmlns:w16du="http://schemas.microsoft.com/office/word/2023/wordml/word16du" xmlns:w16sdtdh="http://schemas.microsoft.com/office/word/2020/wordml/sdtdatahash" xmlns:w16sdtfl="http://schemas.microsoft.com/office/word/2024/wordml/sdtformatlock" xmlns:w16se="http://schemas.microsoft.com/office/word/2015/wordml/symex" mc:Ignorable="w14 w15 w16se w16cid w16 w16cex w16sdtdh w16sdtfl w16du">
   <w:font w:name="Symbol">
     <w:panose1 w:val="05050102010706020507"/>
     <w:charset w:val="02"/>
@@ -4066,25 +4395,23 @@
     <w:pitch w:val="variable"/>
     <w:sig w:usb0="00000287" w:usb1="00000000" w:usb2="00000000" w:usb3="00000000" w:csb0="0000009F" w:csb1="00000000"/>
   </w:font>
-  <w:font w:name="Calibri">
-    <w:panose1 w:val="020F0502020204030204"/>
+  <w:font w:name="Aptos">
     <w:charset w:val="00"/>
     <w:family w:val="swiss"/>
     <w:pitch w:val="variable"/>
-    <w:sig w:usb0="E4002EFF" w:usb1="C200247B" w:usb2="00000009" w:usb3="00000000" w:csb0="000001FF" w:csb1="00000000"/>
+    <w:sig w:usb0="20000287" w:usb1="00000003" w:usb2="00000000" w:usb3="00000000" w:csb0="0000019F" w:csb1="00000000"/>
   </w:font>
-  <w:font w:name="Calibri Light">
-    <w:panose1 w:val="020F0302020204030204"/>
+  <w:font w:name="Aptos Display">
     <w:charset w:val="00"/>
     <w:family w:val="swiss"/>
     <w:pitch w:val="variable"/>
-    <w:sig w:usb0="E4002EFF" w:usb1="C200247B" w:usb2="00000009" w:usb3="00000000" w:csb0="000001FF" w:csb1="00000000"/>
+    <w:sig w:usb0="20000287" w:usb1="00000003" w:usb2="00000000" w:usb3="00000000" w:csb0="0000019F" w:csb1="00000000"/>
   </w:font>
 </w:fonts>
 </file>
 
 <file path=word/glossary/settings.xml><?xml version="1.0" encoding="utf-8"?>
-<w:settings xmlns:mc="http://schemas.openxmlformats.org/markup-compatibility/2006" xmlns:o="urn:schemas-microsoft-com:office:office" xmlns:r="http://schemas.openxmlformats.org/officeDocument/2006/relationships" xmlns:m="http://schemas.openxmlformats.org/officeDocument/2006/math" xmlns:v="urn:schemas-microsoft-com:vml" xmlns:w10="urn:schemas-microsoft-com:office:word" xmlns:w="http://schemas.openxmlformats.org/wordprocessingml/2006/main" xmlns:w14="http://schemas.microsoft.com/office/word/2010/wordml" xmlns:w15="http://schemas.microsoft.com/office/word/2012/wordml" xmlns:w16cex="http://schemas.microsoft.com/office/word/2018/wordml/cex" xmlns:w16cid="http://schemas.microsoft.com/office/word/2016/wordml/cid" xmlns:w16="http://schemas.microsoft.com/office/word/2018/wordml" xmlns:w16sdtdh="http://schemas.microsoft.com/office/word/2020/wordml/sdtdatahash" xmlns:w16se="http://schemas.microsoft.com/office/word/2015/wordml/symex" xmlns:sl="http://schemas.openxmlformats.org/schemaLibrary/2006/main" mc:Ignorable="w14 w15 w16se w16cid w16 w16cex w16sdtdh">
+<w:settings xmlns:mc="http://schemas.openxmlformats.org/markup-compatibility/2006" xmlns:o="urn:schemas-microsoft-com:office:office" xmlns:r="http://schemas.openxmlformats.org/officeDocument/2006/relationships" xmlns:m="http://schemas.openxmlformats.org/officeDocument/2006/math" xmlns:v="urn:schemas-microsoft-com:vml" xmlns:w10="urn:schemas-microsoft-com:office:word" xmlns:w="http://schemas.openxmlformats.org/wordprocessingml/2006/main" xmlns:w14="http://schemas.microsoft.com/office/word/2010/wordml" xmlns:w15="http://schemas.microsoft.com/office/word/2012/wordml" xmlns:w16cex="http://schemas.microsoft.com/office/word/2018/wordml/cex" xmlns:w16cid="http://schemas.microsoft.com/office/word/2016/wordml/cid" xmlns:w16="http://schemas.microsoft.com/office/word/2018/wordml" xmlns:w16du="http://schemas.microsoft.com/office/word/2023/wordml/word16du" xmlns:w16sdtdh="http://schemas.microsoft.com/office/word/2020/wordml/sdtdatahash" xmlns:w16sdtfl="http://schemas.microsoft.com/office/word/2024/wordml/sdtformatlock" xmlns:w16se="http://schemas.microsoft.com/office/word/2015/wordml/symex" xmlns:sl="http://schemas.openxmlformats.org/schemaLibrary/2006/main" mc:Ignorable="w14 w15 w16se w16cid w16 w16cex w16sdtdh w16sdtfl w16du">
   <w:view w:val="normal"/>
   <w:defaultTabStop w:val="720"/>
   <w:characterSpacingControl w:val="doNotCompress"/>
@@ -4099,10 +4426,14 @@
   </w:compat>
   <w:rsids>
     <w:rsidRoot w:val="004F4065"/>
+    <w:rsid w:val="000E4770"/>
     <w:rsid w:val="001C0419"/>
     <w:rsid w:val="004F4065"/>
+    <w:rsid w:val="005C6065"/>
     <w:rsid w:val="009F461F"/>
     <w:rsid w:val="00A546D8"/>
+    <w:rsid w:val="00AA000D"/>
+    <w:rsid w:val="00B11248"/>
   </w:rsids>
   <m:mathPr>
     <m:mathFont m:val="Cambria Math"/>
@@ -4126,7 +4457,7 @@
 </file>
 
 <file path=word/glossary/styles.xml><?xml version="1.0" encoding="utf-8"?>
-<w:styles xmlns:mc="http://schemas.openxmlformats.org/markup-compatibility/2006" xmlns:r="http://schemas.openxmlformats.org/officeDocument/2006/relationships" xmlns:w="http://schemas.openxmlformats.org/wordprocessingml/2006/main" xmlns:w14="http://schemas.microsoft.com/office/word/2010/wordml" xmlns:w15="http://schemas.microsoft.com/office/word/2012/wordml" xmlns:w16cex="http://schemas.microsoft.com/office/word/2018/wordml/cex" xmlns:w16cid="http://schemas.microsoft.com/office/word/2016/wordml/cid" xmlns:w16="http://schemas.microsoft.com/office/word/2018/wordml" xmlns:w16sdtdh="http://schemas.microsoft.com/office/word/2020/wordml/sdtdatahash" xmlns:w16se="http://schemas.microsoft.com/office/word/2015/wordml/symex" mc:Ignorable="w14 w15 w16se w16cid w16 w16cex w16sdtdh">
+<w:styles xmlns:mc="http://schemas.openxmlformats.org/markup-compatibility/2006" xmlns:r="http://schemas.openxmlformats.org/officeDocument/2006/relationships" xmlns:w="http://schemas.openxmlformats.org/wordprocessingml/2006/main" xmlns:w14="http://schemas.microsoft.com/office/word/2010/wordml" xmlns:w15="http://schemas.microsoft.com/office/word/2012/wordml" xmlns:w16cex="http://schemas.microsoft.com/office/word/2018/wordml/cex" xmlns:w16cid="http://schemas.microsoft.com/office/word/2016/wordml/cid" xmlns:w16="http://schemas.microsoft.com/office/word/2018/wordml" xmlns:w16du="http://schemas.microsoft.com/office/word/2023/wordml/word16du" xmlns:w16sdtdh="http://schemas.microsoft.com/office/word/2020/wordml/sdtdatahash" xmlns:w16sdtfl="http://schemas.microsoft.com/office/word/2024/wordml/sdtformatlock" xmlns:w16se="http://schemas.microsoft.com/office/word/2015/wordml/symex" mc:Ignorable="w14 w15 w16se w16cid w16 w16cex w16sdtdh w16sdtfl w16du">
   <w:docDefaults>
     <w:rPrDefault>
       <w:rPr>
@@ -4576,7 +4907,7 @@
 </file>
 
 <file path=word/glossary/webSettings.xml><?xml version="1.0" encoding="utf-8"?>
-<w:webSettings xmlns:mc="http://schemas.openxmlformats.org/markup-compatibility/2006" xmlns:r="http://schemas.openxmlformats.org/officeDocument/2006/relationships" xmlns:w="http://schemas.openxmlformats.org/wordprocessingml/2006/main" xmlns:w14="http://schemas.microsoft.com/office/word/2010/wordml" xmlns:w15="http://schemas.microsoft.com/office/word/2012/wordml" xmlns:w16cex="http://schemas.microsoft.com/office/word/2018/wordml/cex" xmlns:w16cid="http://schemas.microsoft.com/office/word/2016/wordml/cid" xmlns:w16="http://schemas.microsoft.com/office/word/2018/wordml" xmlns:w16sdtdh="http://schemas.microsoft.com/office/word/2020/wordml/sdtdatahash" xmlns:w16se="http://schemas.microsoft.com/office/word/2015/wordml/symex" mc:Ignorable="w14 w15 w16se w16cid w16 w16cex w16sdtdh">
+<w:webSettings xmlns:mc="http://schemas.openxmlformats.org/markup-compatibility/2006" xmlns:r="http://schemas.openxmlformats.org/officeDocument/2006/relationships" xmlns:w="http://schemas.openxmlformats.org/wordprocessingml/2006/main" xmlns:w14="http://schemas.microsoft.com/office/word/2010/wordml" xmlns:w15="http://schemas.microsoft.com/office/word/2012/wordml" xmlns:w16cex="http://schemas.microsoft.com/office/word/2018/wordml/cex" xmlns:w16cid="http://schemas.microsoft.com/office/word/2016/wordml/cid" xmlns:w16="http://schemas.microsoft.com/office/word/2018/wordml" xmlns:w16du="http://schemas.microsoft.com/office/word/2023/wordml/word16du" xmlns:w16sdtdh="http://schemas.microsoft.com/office/word/2020/wordml/sdtdatahash" xmlns:w16sdtfl="http://schemas.microsoft.com/office/word/2024/wordml/sdtformatlock" xmlns:w16se="http://schemas.microsoft.com/office/word/2015/wordml/symex" mc:Ignorable="w14 w15 w16se w16cid w16 w16cex w16sdtdh w16sdtfl w16du">
   <w:optimizeForBrowser/>
   <w:allowPNG/>
 </w:webSettings>
@@ -4844,6 +5175,19 @@
 </file>
 
 <file path=customXml/item1.xml><?xml version="1.0" encoding="utf-8"?>
+<b:Sources xmlns:b="http://schemas.openxmlformats.org/officeDocument/2006/bibliography" xmlns="http://schemas.openxmlformats.org/officeDocument/2006/bibliography" SelectedStyle="/APASixthEditionOfficeOnline.xsl" StyleName="APA" Version="6"/>
+</file>
+
+<file path=customXml/item2.xml><?xml version="1.0" encoding="utf-8"?>
+<?mso-contentType ?>
+<FormTemplates xmlns="http://schemas.microsoft.com/sharepoint/v3/contenttype/forms">
+  <Display>DocumentLibraryForm</Display>
+  <Edit>DocumentLibraryForm</Edit>
+  <New>DocumentLibraryForm</New>
+</FormTemplates>
+</file>
+
+<file path=customXml/item3.xml><?xml version="1.0" encoding="utf-8"?>
 <p:properties xmlns:p="http://schemas.microsoft.com/office/2006/metadata/properties" xmlns:xsi="http://www.w3.org/2001/XMLSchema-instance" xmlns:pc="http://schemas.microsoft.com/office/infopath/2007/PartnerControls">
   <documentManagement>
     <_ip_UnifiedCompliancePolicyUIAction xmlns="http://schemas.microsoft.com/sharepoint/v3" xsi:nil="true"/>
@@ -4863,7 +5207,7 @@
 </p:properties>
 </file>
 
-<file path=customXml/item2.xml><?xml version="1.0" encoding="utf-8"?>
+<file path=customXml/item4.xml><?xml version="1.0" encoding="utf-8"?>
 <ct:contentTypeSchema xmlns:ct="http://schemas.microsoft.com/office/2006/metadata/contentType" xmlns:ma="http://schemas.microsoft.com/office/2006/metadata/properties/metaAttributes" ct:_="" ma:_="" ma:contentTypeName="Document" ma:contentTypeID="0x01010079F111ED35F8CC479449609E8A0923A6" ma:contentTypeVersion="26" ma:contentTypeDescription="Create a new document." ma:contentTypeScope="" ma:versionID="ac37c1753acd5e330d2062ccec26ea66">
   <xsd:schema xmlns:xsd="http://www.w3.org/2001/XMLSchema" xmlns:xs="http://www.w3.org/2001/XMLSchema" xmlns:p="http://schemas.microsoft.com/office/2006/metadata/properties" xmlns:ns1="http://schemas.microsoft.com/sharepoint/v3" xmlns:ns2="71af3243-3dd4-4a8d-8c0d-dd76da1f02a5" xmlns:ns3="16c05727-aa75-4e4a-9b5f-8a80a1165891" xmlns:ns4="230e9df3-be65-4c73-a93b-d1236ebd677e" targetNamespace="http://schemas.microsoft.com/office/2006/metadata/properties" ma:root="true" ma:fieldsID="3b340c7101c92c5120abd06486f94548" ns1:_="" ns2:_="" ns3:_="" ns4:_="">
     <xsd:import namespace="http://schemas.microsoft.com/sharepoint/v3"/>
@@ -5163,20 +5507,23 @@
 </ct:contentTypeSchema>
 </file>
 
-<file path=customXml/item3.xml><?xml version="1.0" encoding="utf-8"?>
-<b:Sources xmlns:b="http://schemas.openxmlformats.org/officeDocument/2006/bibliography" xmlns="http://schemas.openxmlformats.org/officeDocument/2006/bibliography" SelectedStyle="/APASixthEditionOfficeOnline.xsl" StyleName="APA" Version="6"/>
+<file path=customXml/itemProps1.xml><?xml version="1.0" encoding="utf-8"?>
+<ds:datastoreItem xmlns:ds="http://schemas.openxmlformats.org/officeDocument/2006/customXml" ds:itemID="{FDFCF9E5-1071-4C3D-AA44-7E8B97CFD0B3}">
+  <ds:schemaRefs>
+    <ds:schemaRef ds:uri="http://schemas.openxmlformats.org/officeDocument/2006/bibliography"/>
+  </ds:schemaRefs>
+</ds:datastoreItem>
 </file>
 
-<file path=customXml/item4.xml><?xml version="1.0" encoding="utf-8"?>
-<?mso-contentType ?>
-<FormTemplates xmlns="http://schemas.microsoft.com/sharepoint/v3/contenttype/forms">
-  <Display>DocumentLibraryForm</Display>
-  <Edit>DocumentLibraryForm</Edit>
-  <New>DocumentLibraryForm</New>
-</FormTemplates>
+<file path=customXml/itemProps2.xml><?xml version="1.0" encoding="utf-8"?>
+<ds:datastoreItem xmlns:ds="http://schemas.openxmlformats.org/officeDocument/2006/customXml" ds:itemID="{B5096CFC-93AE-4516-98C2-08D811E078E2}">
+  <ds:schemaRefs>
+    <ds:schemaRef ds:uri="http://schemas.microsoft.com/sharepoint/v3/contenttype/forms"/>
+  </ds:schemaRefs>
+</ds:datastoreItem>
 </file>
 
-<file path=customXml/itemProps1.xml><?xml version="1.0" encoding="utf-8"?>
+<file path=customXml/itemProps3.xml><?xml version="1.0" encoding="utf-8"?>
 <ds:datastoreItem xmlns:ds="http://schemas.openxmlformats.org/officeDocument/2006/customXml" ds:itemID="{453ACD3A-016A-4DA1-BDB8-A4D0D5066FFD}">
   <ds:schemaRefs>
     <ds:schemaRef ds:uri="http://schemas.microsoft.com/office/2006/metadata/properties"/>
@@ -5188,7 +5535,7 @@
 </ds:datastoreItem>
 </file>
 
-<file path=customXml/itemProps2.xml><?xml version="1.0" encoding="utf-8"?>
+<file path=customXml/itemProps4.xml><?xml version="1.0" encoding="utf-8"?>
 <ds:datastoreItem xmlns:ds="http://schemas.openxmlformats.org/officeDocument/2006/customXml" ds:itemID="{BC949AC9-09B6-410F-BCB1-38C226FEBCB2}">
   <ds:schemaRefs>
     <ds:schemaRef ds:uri="http://schemas.microsoft.com/office/2006/metadata/contentType"/>
@@ -5209,22 +5556,6 @@
 </ds:datastoreItem>
 </file>
 
-<file path=customXml/itemProps3.xml><?xml version="1.0" encoding="utf-8"?>
-<ds:datastoreItem xmlns:ds="http://schemas.openxmlformats.org/officeDocument/2006/customXml" ds:itemID="{FDFCF9E5-1071-4C3D-AA44-7E8B97CFD0B3}">
-  <ds:schemaRefs>
-    <ds:schemaRef ds:uri="http://schemas.openxmlformats.org/officeDocument/2006/bibliography"/>
-  </ds:schemaRefs>
-</ds:datastoreItem>
-</file>
-
-<file path=customXml/itemProps4.xml><?xml version="1.0" encoding="utf-8"?>
-<ds:datastoreItem xmlns:ds="http://schemas.openxmlformats.org/officeDocument/2006/customXml" ds:itemID="{B5096CFC-93AE-4516-98C2-08D811E078E2}">
-  <ds:schemaRefs>
-    <ds:schemaRef ds:uri="http://schemas.microsoft.com/sharepoint/v3/contenttype/forms"/>
-  </ds:schemaRefs>
-</ds:datastoreItem>
-</file>
-
 <file path=docMetadata/LabelInfo.xml><?xml version="1.0" encoding="utf-8"?>
 <clbl:labelList xmlns:clbl="http://schemas.microsoft.com/office/2020/mipLabelMetadata"/>
 </file>
</xml_diff>